<commit_message>
1st approved; 2nd edited
</commit_message>
<xml_diff>
--- a/BystrovMD_CR_2.docx
+++ b/BystrovMD_CR_2.docx
@@ -219,7 +219,21 @@
               <w:rPr>
                 <w:rFonts w:ascii="Times New Roman" w:hAnsi="Times New Roman" w:cs="Times New Roman"/>
               </w:rPr>
-              <w:t>доц., канд. экон. наук, доц.</w:t>
+              <w:t xml:space="preserve">доц., канд. </w:t>
+            </w:r>
+            <w:proofErr w:type="spellStart"/>
+            <w:r>
+              <w:rPr>
+                <w:rFonts w:ascii="Times New Roman" w:hAnsi="Times New Roman" w:cs="Times New Roman"/>
+              </w:rPr>
+              <w:t>экон</w:t>
+            </w:r>
+            <w:proofErr w:type="spellEnd"/>
+            <w:r>
+              <w:rPr>
+                <w:rFonts w:ascii="Times New Roman" w:hAnsi="Times New Roman" w:cs="Times New Roman"/>
+              </w:rPr>
+              <w:t>. наук, доц.</w:t>
             </w:r>
           </w:p>
         </w:tc>
@@ -1745,7 +1759,7 @@
                 <w:sz w:val="28"/>
                 <w:szCs w:val="28"/>
               </w:rPr>
-              <w:t>7</w:t>
+              <w:t>8</w:t>
             </w:r>
             <w:r>
               <w:rPr>
@@ -1787,12 +1801,14 @@
       <w:r>
         <w:br w:type="page"/>
       </w:r>
+      <w:bookmarkStart w:id="0" w:name="_GoBack"/>
+      <w:bookmarkEnd w:id="0"/>
     </w:p>
     <w:p>
       <w:pPr>
         <w:pStyle w:val="1"/>
       </w:pPr>
-      <w:bookmarkStart w:id="0" w:name="_Toc224081278"/>
+      <w:bookmarkStart w:id="1" w:name="_Toc224081278"/>
       <w:r>
         <w:rPr>
           <w:lang w:val="en-US"/>
@@ -1803,14 +1819,30 @@
       <w:r>
         <w:t xml:space="preserve"> анализ</w:t>
       </w:r>
-      <w:bookmarkEnd w:id="0"/>
+      <w:bookmarkEnd w:id="1"/>
     </w:p>
     <w:p>
       <w:pPr>
         <w:pStyle w:val="default1"/>
       </w:pPr>
       <w:r>
-        <w:t>Выбранный программный продукт – автоматизированная система диспетчерского управления пассажирским транспортом «Маршрутинка» (АСДУ ПТ «Маршрутинка»).</w:t>
+        <w:t>Выбранный программный продукт – автоматизированная система диспетчерского управления пассажирским транспортом «</w:t>
+      </w:r>
+      <w:proofErr w:type="spellStart"/>
+      <w:r>
+        <w:t>Маршрутинка</w:t>
+      </w:r>
+      <w:proofErr w:type="spellEnd"/>
+      <w:r>
+        <w:t>» (АСДУ ПТ «</w:t>
+      </w:r>
+      <w:proofErr w:type="spellStart"/>
+      <w:r>
+        <w:t>Маршрутинка</w:t>
+      </w:r>
+      <w:proofErr w:type="spellEnd"/>
+      <w:r>
+        <w:t>»).</w:t>
       </w:r>
     </w:p>
     <w:p>
@@ -1851,7 +1883,15 @@
         <w:t>SWOT</w:t>
       </w:r>
       <w:r>
-        <w:t>-анализ для АСДУ ПТ «Маршрутинка»</w:t>
+        <w:t>-анализ для АСДУ ПТ «</w:t>
+      </w:r>
+      <w:proofErr w:type="spellStart"/>
+      <w:r>
+        <w:t>Маршрутинка</w:t>
+      </w:r>
+      <w:proofErr w:type="spellEnd"/>
+      <w:r>
+        <w:t>»</w:t>
       </w:r>
     </w:p>
     <w:tbl>
@@ -1892,8 +1932,16 @@
               <w:rPr>
                 <w:sz w:val="24"/>
               </w:rPr>
-              <w:t xml:space="preserve"> Маршрутинка</w:t>
-            </w:r>
+              <w:t xml:space="preserve"> </w:t>
+            </w:r>
+            <w:proofErr w:type="spellStart"/>
+            <w:r>
+              <w:rPr>
+                <w:sz w:val="24"/>
+              </w:rPr>
+              <w:t>Маршрутинка</w:t>
+            </w:r>
+            <w:proofErr w:type="spellEnd"/>
           </w:p>
         </w:tc>
         <w:tc>
@@ -2103,6 +2151,8 @@
                 <w:sz w:val="24"/>
               </w:rPr>
             </w:pPr>
+            <w:proofErr w:type="spellStart"/>
+            <w:proofErr w:type="gramStart"/>
             <w:r>
               <w:rPr>
                 <w:b/>
@@ -2121,7 +2171,15 @@
               <w:rPr>
                 <w:sz w:val="24"/>
               </w:rPr>
-              <w:t>узкая специализация может вызвать сложности в нахождении спроса</w:t>
+              <w:t>узкая</w:t>
+            </w:r>
+            <w:proofErr w:type="spellEnd"/>
+            <w:proofErr w:type="gramEnd"/>
+            <w:r>
+              <w:rPr>
+                <w:sz w:val="24"/>
+              </w:rPr>
+              <w:t xml:space="preserve"> специализация может вызвать сложности в нахождении спроса</w:t>
             </w:r>
             <w:r>
               <w:rPr>
@@ -2326,13 +2384,43 @@
               <w:rPr>
                 <w:sz w:val="24"/>
               </w:rPr>
-              <w:t>: Возможность</w:t>
-            </w:r>
-            <w:r>
-              <w:rPr>
-                <w:sz w:val="24"/>
-              </w:rPr>
-              <w:t xml:space="preserve"> интеграции с существующими системами, например, АСУ-Навигация</w:t>
+              <w:t xml:space="preserve">: </w:t>
+            </w:r>
+            <w:r>
+              <w:rPr>
+                <w:sz w:val="24"/>
+              </w:rPr>
+              <w:t>Существующие на рынке популярные решения имеют высокий уровень</w:t>
+            </w:r>
+            <w:r>
+              <w:rPr>
+                <w:sz w:val="24"/>
+              </w:rPr>
+              <w:t xml:space="preserve"> доступности интеграций</w:t>
+            </w:r>
+            <w:r>
+              <w:rPr>
+                <w:sz w:val="24"/>
+              </w:rPr>
+              <w:t xml:space="preserve">, что дает возможность </w:t>
+            </w:r>
+            <w:r>
+              <w:rPr>
+                <w:sz w:val="24"/>
+              </w:rPr>
+              <w:t xml:space="preserve">упростить процесс </w:t>
+            </w:r>
+            <w:r>
+              <w:rPr>
+                <w:sz w:val="24"/>
+              </w:rPr>
+              <w:t>внедрения</w:t>
+            </w:r>
+            <w:r>
+              <w:rPr>
+                <w:sz w:val="24"/>
+              </w:rPr>
+              <w:t xml:space="preserve"> либо интегрировать в существующие системы только часть модулей</w:t>
             </w:r>
             <w:r>
               <w:rPr>
@@ -2368,7 +2456,14 @@
               <w:rPr>
                 <w:sz w:val="24"/>
               </w:rPr>
-              <w:t xml:space="preserve"> аналогичные решения по большей части устарели</w:t>
+              <w:t xml:space="preserve"> </w:t>
+            </w:r>
+            <w:r>
+              <w:rPr>
+                <w:sz w:val="24"/>
+              </w:rPr>
+              <w:lastRenderedPageBreak/>
+              <w:t>аналогичные решения по большей части устарели</w:t>
             </w:r>
           </w:p>
         </w:tc>
@@ -2390,8 +2485,10 @@
                 <w:b/>
                 <w:sz w:val="24"/>
               </w:rPr>
+              <w:lastRenderedPageBreak/>
               <w:t>Распространение благодаря соответствию закону</w:t>
             </w:r>
+            <w:proofErr w:type="gramStart"/>
             <w:r>
               <w:rPr>
                 <w:sz w:val="24"/>
@@ -2402,7 +2499,14 @@
               <w:rPr>
                 <w:sz w:val="24"/>
               </w:rPr>
-              <w:t xml:space="preserve">ь </w:t>
+              <w:t>ь</w:t>
+            </w:r>
+            <w:proofErr w:type="gramEnd"/>
+            <w:r>
+              <w:rPr>
+                <w:sz w:val="24"/>
+              </w:rPr>
+              <w:t xml:space="preserve"> </w:t>
             </w:r>
             <w:r>
               <w:rPr>
@@ -2446,17 +2550,25 @@
               </w:rPr>
               <w:t>преимущество</w:t>
             </w:r>
-            <w:r>
-              <w:rPr>
-                <w:sz w:val="24"/>
-              </w:rPr>
-              <w:t>: Благодаря автоматизации и контролю в реальном времени, активно замещать «устаревшие</w:t>
-            </w:r>
-            <w:r>
-              <w:rPr>
-                <w:sz w:val="24"/>
-              </w:rPr>
-              <w:t xml:space="preserve"> решения» конкурентов на рынке.</w:t>
+            <w:proofErr w:type="gramStart"/>
+            <w:r>
+              <w:rPr>
+                <w:sz w:val="24"/>
+              </w:rPr>
+              <w:t>: Благодаря</w:t>
+            </w:r>
+            <w:proofErr w:type="gramEnd"/>
+            <w:r>
+              <w:rPr>
+                <w:sz w:val="24"/>
+              </w:rPr>
+              <w:t xml:space="preserve"> автоматизации и контролю в реальном времени, активно замещать устаревшие</w:t>
+            </w:r>
+            <w:r>
+              <w:rPr>
+                <w:sz w:val="24"/>
+              </w:rPr>
+              <w:t xml:space="preserve"> решения конкурентов на рынке.</w:t>
             </w:r>
           </w:p>
           <w:p>
@@ -2476,11 +2588,19 @@
               </w:rPr>
               <w:t>Создание экосистем</w:t>
             </w:r>
-            <w:r>
-              <w:rPr>
-                <w:sz w:val="24"/>
-              </w:rPr>
-              <w:t xml:space="preserve">: Использовать возможность </w:t>
+            <w:proofErr w:type="gramStart"/>
+            <w:r>
+              <w:rPr>
+                <w:sz w:val="24"/>
+              </w:rPr>
+              <w:t>: Использовать</w:t>
+            </w:r>
+            <w:proofErr w:type="gramEnd"/>
+            <w:r>
+              <w:rPr>
+                <w:sz w:val="24"/>
+              </w:rPr>
+              <w:t xml:space="preserve"> возможность </w:t>
             </w:r>
             <w:r>
               <w:rPr>
@@ -2544,6 +2664,7 @@
               </w:rPr>
               <w:t xml:space="preserve"> рынка</w:t>
             </w:r>
+            <w:proofErr w:type="gramStart"/>
             <w:r>
               <w:rPr>
                 <w:sz w:val="24"/>
@@ -2554,7 +2675,14 @@
               <w:rPr>
                 <w:sz w:val="24"/>
               </w:rPr>
-              <w:t>Расширять специализацию (виды мониторинга)</w:t>
+              <w:t>Расширять</w:t>
+            </w:r>
+            <w:proofErr w:type="gramEnd"/>
+            <w:r>
+              <w:rPr>
+                <w:sz w:val="24"/>
+              </w:rPr>
+              <w:t xml:space="preserve"> специализацию (виды мониторинга)</w:t>
             </w:r>
             <w:r>
               <w:rPr>
@@ -2768,13 +2896,27 @@
               <w:rPr>
                 <w:sz w:val="24"/>
               </w:rPr>
-              <w:t xml:space="preserve"> DD</w:t>
-            </w:r>
-            <w:r>
-              <w:rPr>
-                <w:sz w:val="24"/>
-              </w:rPr>
-              <w:t>oS-атак, способных</w:t>
+              <w:t xml:space="preserve"> </w:t>
+            </w:r>
+            <w:proofErr w:type="spellStart"/>
+            <w:r>
+              <w:rPr>
+                <w:sz w:val="24"/>
+              </w:rPr>
+              <w:t>DD</w:t>
+            </w:r>
+            <w:r>
+              <w:rPr>
+                <w:sz w:val="24"/>
+              </w:rPr>
+              <w:t>oS</w:t>
+            </w:r>
+            <w:proofErr w:type="spellEnd"/>
+            <w:r>
+              <w:rPr>
+                <w:sz w:val="24"/>
+              </w:rPr>
+              <w:t>-атак, способных</w:t>
             </w:r>
             <w:r>
               <w:rPr>
@@ -2864,18 +3006,49 @@
                 <w:sz w:val="24"/>
               </w:rPr>
             </w:pPr>
+            <w:proofErr w:type="spellStart"/>
             <w:r>
               <w:rPr>
                 <w:b/>
                 <w:sz w:val="24"/>
               </w:rPr>
-              <w:t>Киберустойчивость как преимущество</w:t>
-            </w:r>
-            <w:r>
-              <w:rPr>
-                <w:sz w:val="24"/>
-              </w:rPr>
-              <w:t>: Сделать акцент на защищенности ПО от DDoS-атак в маркетинге, противопоставляя это решениям, навязанным регуляторами, которые могут быть менее стабильны.</w:t>
+              <w:t>Киберустойчивость</w:t>
+            </w:r>
+            <w:proofErr w:type="spellEnd"/>
+            <w:r>
+              <w:rPr>
+                <w:b/>
+                <w:sz w:val="24"/>
+              </w:rPr>
+              <w:t xml:space="preserve"> как преимущество</w:t>
+            </w:r>
+            <w:proofErr w:type="gramStart"/>
+            <w:r>
+              <w:rPr>
+                <w:sz w:val="24"/>
+              </w:rPr>
+              <w:t>: Сделать</w:t>
+            </w:r>
+            <w:proofErr w:type="gramEnd"/>
+            <w:r>
+              <w:rPr>
+                <w:sz w:val="24"/>
+              </w:rPr>
+              <w:t xml:space="preserve"> акцент на защищенности ПО от </w:t>
+            </w:r>
+            <w:proofErr w:type="spellStart"/>
+            <w:r>
+              <w:rPr>
+                <w:sz w:val="24"/>
+              </w:rPr>
+              <w:t>DDoS</w:t>
+            </w:r>
+            <w:proofErr w:type="spellEnd"/>
+            <w:r>
+              <w:rPr>
+                <w:sz w:val="24"/>
+              </w:rPr>
+              <w:t>-атак в маркетинге, противопоставляя это решениям, навязанным регуляторами, которые могут быть менее стабильны.</w:t>
             </w:r>
           </w:p>
         </w:tc>
@@ -2899,11 +3072,19 @@
               </w:rPr>
               <w:t>Диверсификация оборудования</w:t>
             </w:r>
-            <w:r>
-              <w:rPr>
-                <w:sz w:val="24"/>
-              </w:rPr>
-              <w:t>: Снизить зависимость от конкретных бортовых устройств, сделав систему мультиплатформенной. Это поможет выстоять при сбоях в поставках или санкционном давлении.</w:t>
+            <w:proofErr w:type="gramStart"/>
+            <w:r>
+              <w:rPr>
+                <w:sz w:val="24"/>
+              </w:rPr>
+              <w:t>: Снизить</w:t>
+            </w:r>
+            <w:proofErr w:type="gramEnd"/>
+            <w:r>
+              <w:rPr>
+                <w:sz w:val="24"/>
+              </w:rPr>
+              <w:t xml:space="preserve"> зависимость от конкретных бортовых устройств, сделав систему мультиплатформенной. Это поможет выстоять при сбоях в поставках или санкционном давлении.</w:t>
             </w:r>
           </w:p>
           <w:p>
@@ -2960,21 +3141,53 @@
       <w:pPr>
         <w:pStyle w:val="1"/>
       </w:pPr>
-      <w:bookmarkStart w:id="1" w:name="_Toc224081279"/>
+      <w:bookmarkStart w:id="2" w:name="_Toc224081279"/>
       <w:r>
         <w:t>Холст бизнес-модели</w:t>
       </w:r>
-      <w:bookmarkEnd w:id="1"/>
+      <w:bookmarkEnd w:id="2"/>
     </w:p>
     <w:p>
       <w:pPr>
         <w:pStyle w:val="default1"/>
       </w:pPr>
       <w:r>
-        <w:t>Для составления холста бизнес-модели будет использован шаблон А. Остервальдера и И. Пинье.</w:t>
-      </w:r>
-      <w:r>
-        <w:t xml:space="preserve"> Будет рассмотрена фирма, занимающейся разработкой основного продукта - АСДУ ПТ «Маршрутинка».</w:t>
+        <w:t xml:space="preserve">Для составления холста бизнес-модели будет использован шаблон А. </w:t>
+      </w:r>
+      <w:proofErr w:type="spellStart"/>
+      <w:r>
+        <w:t>Остервальдера</w:t>
+      </w:r>
+      <w:proofErr w:type="spellEnd"/>
+      <w:r>
+        <w:t xml:space="preserve"> и </w:t>
+      </w:r>
+      <w:proofErr w:type="spellStart"/>
+      <w:r>
+        <w:t>И</w:t>
+      </w:r>
+      <w:proofErr w:type="spellEnd"/>
+      <w:r>
+        <w:t xml:space="preserve">. </w:t>
+      </w:r>
+      <w:proofErr w:type="spellStart"/>
+      <w:r>
+        <w:t>Пинье</w:t>
+      </w:r>
+      <w:proofErr w:type="spellEnd"/>
+      <w:r>
+        <w:t>.</w:t>
+      </w:r>
+      <w:r>
+        <w:t xml:space="preserve"> Будет рассмотрена фирма, занимающейся разработкой основного продукта - АСДУ ПТ «</w:t>
+      </w:r>
+      <w:proofErr w:type="spellStart"/>
+      <w:r>
+        <w:t>Маршрутинка</w:t>
+      </w:r>
+      <w:proofErr w:type="spellEnd"/>
+      <w:r>
+        <w:t>».</w:t>
       </w:r>
     </w:p>
     <w:p>
@@ -2985,8 +3198,6 @@
       <w:r>
         <w:t>Таблица 2 Холст бизнес-модели</w:t>
       </w:r>
-      <w:bookmarkStart w:id="2" w:name="_GoBack"/>
-      <w:bookmarkEnd w:id="2"/>
     </w:p>
     <w:tbl>
       <w:tblPr>
@@ -3896,7 +4107,21 @@
               <w:rPr>
                 <w:sz w:val="24"/>
               </w:rPr>
-              <w:t>Доходы от выполнения кастомизаций ПО</w:t>
+              <w:t xml:space="preserve">Доходы от выполнения </w:t>
+            </w:r>
+            <w:proofErr w:type="spellStart"/>
+            <w:r>
+              <w:rPr>
+                <w:sz w:val="24"/>
+              </w:rPr>
+              <w:t>кастомизаций</w:t>
+            </w:r>
+            <w:proofErr w:type="spellEnd"/>
+            <w:r>
+              <w:rPr>
+                <w:sz w:val="24"/>
+              </w:rPr>
+              <w:t xml:space="preserve"> ПО</w:t>
             </w:r>
           </w:p>
         </w:tc>
@@ -3927,10 +4152,15 @@
         <w:pStyle w:val="default1"/>
       </w:pPr>
       <w:r>
-        <w:t>АСДУ ПТ «Маршрутинка»</w:t>
-      </w:r>
-      <w:r>
-        <w:t xml:space="preserve"> -</w:t>
+        <w:t>АСДУ ПТ «</w:t>
+      </w:r>
+      <w:proofErr w:type="spellStart"/>
+      <w:r>
+        <w:t>Маршрутинка</w:t>
+      </w:r>
+      <w:proofErr w:type="spellEnd"/>
+      <w:r>
+        <w:t>» -</w:t>
       </w:r>
       <w:r>
         <w:t xml:space="preserve"> программная</w:t>
@@ -4014,7 +4244,15 @@
         <w:t xml:space="preserve"> диспетчеризации</w:t>
       </w:r>
       <w:r>
-        <w:t xml:space="preserve"> «Маршрутинка», поскольку система решает все вышеперечисленные проблемы и имеет возможность интеграции с существующим решением, использующемся на предприятии.</w:t>
+        <w:t xml:space="preserve"> «</w:t>
+      </w:r>
+      <w:proofErr w:type="spellStart"/>
+      <w:r>
+        <w:t>Маршрутинка</w:t>
+      </w:r>
+      <w:proofErr w:type="spellEnd"/>
+      <w:r>
+        <w:t>», поскольку система решает все вышеперечисленные проблемы и имеет возможность интеграции с существующим решением, использующемся на предприятии.</w:t>
       </w:r>
       <w:r>
         <w:t xml:space="preserve"> </w:t>
@@ -4064,10 +4302,7 @@
         <w:pStyle w:val="default1"/>
       </w:pPr>
       <w:r>
-        <w:t>ООО «АТП №13»</w:t>
-      </w:r>
-      <w:r>
-        <w:t xml:space="preserve"> имеет следующие проблемы (</w:t>
+        <w:t>ООО «АТП №13» имеет следующие проблемы (</w:t>
       </w:r>
       <w:r>
         <w:rPr>
@@ -4174,13 +4409,15 @@
         <w:pStyle w:val="default1"/>
       </w:pPr>
       <w:r>
-        <w:t xml:space="preserve">Выбор </w:t>
-      </w:r>
-      <w:r>
-        <w:t>АСДУ ПТ «Маршрутинка»</w:t>
-      </w:r>
-      <w:r>
-        <w:t xml:space="preserve"> в качестве основного инструмента диспетчеризации позволяет предприятию решить вышеперечисленные проблемы, выполнить упомянутые задачи благодаря широкой функциональности и алгоритмической продвинутости решения.</w:t>
+        <w:t>Выбор АСДУ ПТ «</w:t>
+      </w:r>
+      <w:proofErr w:type="spellStart"/>
+      <w:r>
+        <w:t>Маршрутинка</w:t>
+      </w:r>
+      <w:proofErr w:type="spellEnd"/>
+      <w:r>
+        <w:t>» в качестве основного инструмента диспетчеризации позволяет предприятию решить вышеперечисленные проблемы, выполнить упомянутые задачи благодаря широкой функциональности и алгоритмической продвинутости решения.</w:t>
       </w:r>
     </w:p>
     <w:p>
@@ -4203,7 +4440,15 @@
         <w:pStyle w:val="default1"/>
       </w:pPr>
       <w:r>
-        <w:t>IT-продукт: АСДУ ПТ «Маршрутинка».</w:t>
+        <w:t>IT-продукт: АСДУ ПТ «</w:t>
+      </w:r>
+      <w:proofErr w:type="spellStart"/>
+      <w:r>
+        <w:t>Маршрутинка</w:t>
+      </w:r>
+      <w:proofErr w:type="spellEnd"/>
+      <w:r>
+        <w:t>».</w:t>
       </w:r>
     </w:p>
     <w:p>
@@ -4231,6 +4476,7 @@
       <w:pPr>
         <w:pStyle w:val="default1"/>
       </w:pPr>
+      <w:proofErr w:type="spellStart"/>
       <w:r>
         <w:rPr>
           <w:i/>
@@ -4238,6 +4484,7 @@
         </w:rPr>
         <w:t>Трипваер</w:t>
       </w:r>
+      <w:proofErr w:type="spellEnd"/>
       <w:r>
         <w:t>:</w:t>
       </w:r>
@@ -4270,12 +4517,21 @@
       <w:pPr>
         <w:pStyle w:val="default1"/>
       </w:pPr>
+      <w:proofErr w:type="spellStart"/>
       <w:r>
         <w:rPr>
           <w:i/>
           <w:iCs/>
         </w:rPr>
-        <w:t>Максимизатор прибыли</w:t>
+        <w:t>Максимизатор</w:t>
+      </w:r>
+      <w:proofErr w:type="spellEnd"/>
+      <w:r>
+        <w:rPr>
+          <w:i/>
+          <w:iCs/>
+        </w:rPr>
+        <w:t xml:space="preserve"> прибыли</w:t>
       </w:r>
       <w:r>
         <w:t>:</w:t>
@@ -4312,10 +4568,25 @@
     </w:p>
     <w:p>
       <w:pPr>
+        <w:rPr>
+          <w:rFonts w:ascii="Times New Roman" w:hAnsi="Times New Roman" w:cs="Times New Roman"/>
+          <w:b/>
+          <w:bCs/>
+          <w:sz w:val="32"/>
+          <w:szCs w:val="32"/>
+        </w:rPr>
+      </w:pPr>
+      <w:bookmarkStart w:id="7" w:name="_Toc224081283"/>
+      <w:r>
+        <w:br w:type="page"/>
+      </w:r>
+    </w:p>
+    <w:p>
+      <w:pPr>
         <w:pStyle w:val="1"/>
       </w:pPr>
-      <w:bookmarkStart w:id="7" w:name="_Toc224081283"/>
-      <w:r>
+      <w:r>
+        <w:lastRenderedPageBreak/>
         <w:t>Позиционирование продукта</w:t>
       </w:r>
       <w:bookmarkEnd w:id="7"/>
@@ -4324,43 +4595,44 @@
       <w:pPr>
         <w:pStyle w:val="default1"/>
       </w:pPr>
+      <w:r>
+        <w:t>IT-продукт: АСДУ ПТ «</w:t>
+      </w:r>
+      <w:proofErr w:type="spellStart"/>
+      <w:r>
+        <w:t>Маршрутинка</w:t>
+      </w:r>
+      <w:proofErr w:type="spellEnd"/>
+      <w:r>
+        <w:t>»</w:t>
+      </w:r>
     </w:p>
     <w:p>
       <w:pPr>
         <w:pStyle w:val="default1"/>
       </w:pPr>
-    </w:p>
-    <w:p>
-      <w:pPr>
-        <w:pStyle w:val="default1"/>
-      </w:pPr>
-      <w:r>
-        <w:t>IT-продукт: АСДУ ПТ «Маршрутинка»</w:t>
-      </w:r>
-    </w:p>
-    <w:p>
-      <w:pPr>
-        <w:pStyle w:val="default1"/>
-      </w:pPr>
-      <w:r>
-        <w:lastRenderedPageBreak/>
+      <w:r>
         <w:t>Основные конкуренты:</w:t>
       </w:r>
       <w:r>
         <w:t xml:space="preserve"> АСУ-Навигация, </w:t>
       </w:r>
+      <w:proofErr w:type="spellStart"/>
       <w:r>
         <w:rPr>
           <w:lang w:val="en-US"/>
         </w:rPr>
         <w:t>Waliot</w:t>
       </w:r>
-      <w:r>
-        <w:t xml:space="preserve">, </w:t>
-      </w:r>
-      <w:r>
-        <w:t>ST Passenger</w:t>
-      </w:r>
+      <w:proofErr w:type="spellEnd"/>
+      <w:r>
+        <w:t xml:space="preserve">, ST </w:t>
+      </w:r>
+      <w:proofErr w:type="spellStart"/>
+      <w:r>
+        <w:t>Passenger</w:t>
+      </w:r>
+      <w:proofErr w:type="spellEnd"/>
       <w:r>
         <w:t>.</w:t>
       </w:r>
@@ -4381,11 +4653,11 @@
         <w:tblLook w:val="04A0" w:firstRow="1" w:lastRow="0" w:firstColumn="1" w:lastColumn="0" w:noHBand="0" w:noVBand="1"/>
       </w:tblPr>
       <w:tblGrid>
-        <w:gridCol w:w="1266"/>
-        <w:gridCol w:w="1579"/>
+        <w:gridCol w:w="1182"/>
+        <w:gridCol w:w="1666"/>
         <w:gridCol w:w="1770"/>
         <w:gridCol w:w="1733"/>
-        <w:gridCol w:w="1585"/>
+        <w:gridCol w:w="1582"/>
         <w:gridCol w:w="1638"/>
       </w:tblGrid>
       <w:tr>
@@ -4572,8 +4844,9 @@
               <w:rPr>
                 <w:sz w:val="24"/>
                 <w:szCs w:val="24"/>
-              </w:rPr>
-              <w:t>Маршутинка</w:t>
+                <w:lang w:val="en-US"/>
+              </w:rPr>
+              <w:t>ST</w:t>
             </w:r>
           </w:p>
         </w:tc>
@@ -4721,6 +4994,7 @@
                 <w:lang w:val="en-US"/>
               </w:rPr>
             </w:pPr>
+            <w:proofErr w:type="spellStart"/>
             <w:r>
               <w:rPr>
                 <w:sz w:val="24"/>
@@ -4729,6 +5003,7 @@
               </w:rPr>
               <w:t>Waliot</w:t>
             </w:r>
+            <w:proofErr w:type="spellEnd"/>
           </w:p>
         </w:tc>
         <w:tc>
@@ -4974,16 +5249,14 @@
               <w:rPr>
                 <w:sz w:val="24"/>
                 <w:szCs w:val="24"/>
-                <w:lang w:val="en-US"/>
               </w:rPr>
             </w:pPr>
             <w:r>
               <w:rPr>
                 <w:sz w:val="24"/>
                 <w:szCs w:val="24"/>
-                <w:lang w:val="en-US"/>
-              </w:rPr>
-              <w:t>1</w:t>
+              </w:rPr>
+              <w:t>5</w:t>
             </w:r>
           </w:p>
         </w:tc>
@@ -5027,14 +5300,29 @@
                 <w:lang w:val="en-US"/>
               </w:rPr>
             </w:pPr>
+            <w:proofErr w:type="spellStart"/>
             <w:r>
               <w:rPr>
                 <w:sz w:val="24"/>
                 <w:szCs w:val="24"/>
-                <w:lang w:val="en-US"/>
-              </w:rPr>
-              <w:t>ST</w:t>
-            </w:r>
+              </w:rPr>
+              <w:t>Марш</w:t>
+            </w:r>
+            <w:r>
+              <w:rPr>
+                <w:sz w:val="24"/>
+                <w:szCs w:val="24"/>
+              </w:rPr>
+              <w:t>р</w:t>
+            </w:r>
+            <w:r>
+              <w:rPr>
+                <w:sz w:val="24"/>
+                <w:szCs w:val="24"/>
+              </w:rPr>
+              <w:t>утинка</w:t>
+            </w:r>
+            <w:proofErr w:type="spellEnd"/>
           </w:p>
         </w:tc>
         <w:tc>
@@ -5201,17 +5489,37 @@
       <w:pPr>
         <w:pStyle w:val="default1"/>
         <w:jc w:val="center"/>
-      </w:pPr>
-      <w:r>
+        <w:rPr>
+          <w:i/>
+          <w:iCs/>
+        </w:rPr>
+      </w:pPr>
+      <w:r>
+        <w:rPr>
+          <w:i/>
+          <w:iCs/>
+        </w:rPr>
         <w:t xml:space="preserve">Рисунок 1 </w:t>
       </w:r>
       <w:r>
+        <w:rPr>
+          <w:i/>
+          <w:iCs/>
+        </w:rPr>
         <w:t>Матрица</w:t>
       </w:r>
       <w:r>
+        <w:rPr>
+          <w:i/>
+          <w:iCs/>
+        </w:rPr>
         <w:t xml:space="preserve"> </w:t>
       </w:r>
       <w:r>
+        <w:rPr>
+          <w:i/>
+          <w:iCs/>
+        </w:rPr>
         <w:t>позиционирования</w:t>
       </w:r>
     </w:p>
@@ -7616,7 +7924,7 @@
     <w:lsdException w:name="Table Web 2" w:semiHidden="1" w:unhideWhenUsed="1"/>
     <w:lsdException w:name="Table Web 3" w:semiHidden="1" w:unhideWhenUsed="1"/>
     <w:lsdException w:name="Balloon Text" w:semiHidden="1" w:unhideWhenUsed="1"/>
-    <w:lsdException w:name="Table Grid" w:semiHidden="1" w:uiPriority="39" w:unhideWhenUsed="1"/>
+    <w:lsdException w:name="Table Grid" w:uiPriority="39"/>
     <w:lsdException w:name="Table Theme" w:semiHidden="1" w:unhideWhenUsed="1"/>
     <w:lsdException w:name="Placeholder Text" w:semiHidden="1"/>
     <w:lsdException w:name="No Spacing" w:uiPriority="1" w:qFormat="1"/>
@@ -8377,7 +8685,7 @@
                   <a:bodyPr/>
                   <a:lstStyle/>
                   <a:p>
-                    <a:fld id="{B02A5A91-C32A-4995-B27F-E72EA874D597}" type="CELLRANGE">
+                    <a:fld id="{3BBC366C-C9C1-4A37-B0AD-6C8E22091A8C}" type="CELLRANGE">
                       <a:rPr lang="en-US"/>
                       <a:pPr/>
                       <a:t>[ДИАПАЗОН ЯЧЕЕК]</a:t>
@@ -8409,7 +8717,7 @@
                   <a:bodyPr/>
                   <a:lstStyle/>
                   <a:p>
-                    <a:fld id="{3B8D268A-75AA-4D96-8775-4BADBA368787}" type="CELLRANGE">
+                    <a:fld id="{0AD24E9C-7CED-43FB-9D66-75B6AB294806}" type="CELLRANGE">
                       <a:rPr lang="ru-RU"/>
                       <a:pPr/>
                       <a:t>[ДИАПАЗОН ЯЧЕЕК]</a:t>
@@ -8442,7 +8750,7 @@
                   <a:bodyPr/>
                   <a:lstStyle/>
                   <a:p>
-                    <a:fld id="{E421D285-D3DE-4171-B0B1-671DD3A15C7A}" type="CELLRANGE">
+                    <a:fld id="{8DDC96BD-75B2-4FA0-A2D7-95DAE8FE7701}" type="CELLRANGE">
                       <a:rPr lang="ru-RU"/>
                       <a:pPr/>
                       <a:t>[ДИАПАЗОН ЯЧЕЕК]</a:t>
@@ -8475,7 +8783,7 @@
                   <a:bodyPr/>
                   <a:lstStyle/>
                   <a:p>
-                    <a:fld id="{203625F4-904F-41CD-A350-3E6518E2150C}" type="CELLRANGE">
+                    <a:fld id="{2E3E50DF-E384-42A6-97E9-BA713900BBF5}" type="CELLRANGE">
                       <a:rPr lang="ru-RU"/>
                       <a:pPr/>
                       <a:t>[ДИАПАЗОН ЯЧЕЕК]</a:t>
@@ -9661,7 +9969,7 @@
 </file>
 
 <file path=customXml/itemProps1.xml><?xml version="1.0" encoding="utf-8"?>
-<ds:datastoreItem xmlns:ds="http://schemas.openxmlformats.org/officeDocument/2006/customXml" ds:itemID="{CFEE5B05-2DD3-4213-B575-A11AFEE14D1C}">
+<ds:datastoreItem xmlns:ds="http://schemas.openxmlformats.org/officeDocument/2006/customXml" ds:itemID="{0C02E204-8A33-4909-8C72-74D2A0E9F2B1}">
   <ds:schemaRefs>
     <ds:schemaRef ds:uri="http://schemas.openxmlformats.org/officeDocument/2006/bibliography"/>
   </ds:schemaRefs>

</xml_diff>